<commit_message>
remove tala project duplicates (again)
</commit_message>
<xml_diff>
--- a/Tala/OSHCwise_README.docx
+++ b/Tala/OSHCwise_README.docx
@@ -9,8 +9,8 @@
           <w:rFonts w:asciiTheme="majorBidi" w:hAnsiTheme="majorBidi"/>
         </w:rPr>
       </w:pPr>
-      <w:bookmarkStart w:id="0" w:name="Xdd2cc1499da2f77afd5eeceaf2159d18c4b0b7b"/>
-      <w:bookmarkStart w:id="1" w:name="run-it"/>
+      <w:bookmarkStart w:id="0" w:name="run-it"/>
+      <w:bookmarkStart w:id="1" w:name="Xdd2cc1499da2f77afd5eeceaf2159d18c4b0b7b"/>
       <w:r>
         <w:rPr>
           <w:rFonts w:asciiTheme="majorBidi" w:hAnsiTheme="majorBidi"/>
@@ -370,7 +370,7 @@
         </w:rPr>
       </w:pPr>
       <w:bookmarkStart w:id="2" w:name="what-is-where"/>
-      <w:bookmarkEnd w:id="1"/>
+      <w:bookmarkEnd w:id="0"/>
       <w:r>
         <w:rPr>
           <w:rFonts w:asciiTheme="majorBidi" w:hAnsiTheme="majorBidi"/>
@@ -1054,13 +1054,7 @@
               <w:rPr>
                 <w:rFonts w:asciiTheme="majorBidi" w:hAnsiTheme="majorBidi" w:cstheme="majorBidi"/>
               </w:rPr>
-              <w:t xml:space="preserve"> </w:t>
-            </w:r>
-            <w:r>
-              <w:rPr>
-                <w:rFonts w:asciiTheme="majorBidi" w:hAnsiTheme="majorBidi" w:cstheme="majorBidi"/>
-              </w:rPr>
-              <w:t>(+ 2 jpg screenshots)</w:t>
+              <w:t xml:space="preserve"> (+ 2 jpg screenshots)</w:t>
             </w:r>
           </w:p>
         </w:tc>
@@ -1433,33 +1427,8 @@
           <w:iCs/>
           <w:color w:val="FF0000"/>
         </w:rPr>
-        <w:t>Chatbot: Muhammad will add it to the corner of the page.</w:t>
-      </w:r>
-    </w:p>
-    <w:p>
-      <w:pPr>
-        <w:pStyle w:val="Heading2"/>
-        <w:rPr>
-          <w:rFonts w:asciiTheme="majorBidi" w:hAnsiTheme="majorBidi"/>
-        </w:rPr>
-      </w:pPr>
-      <w:bookmarkStart w:id="4" w:name="how-an-admin-uses-it"/>
-      <w:bookmarkEnd w:id="3"/>
-      <w:r>
-        <w:rPr>
-          <w:rFonts w:asciiTheme="majorBidi" w:hAnsiTheme="majorBidi"/>
-        </w:rPr>
-        <w:t>4. How an admin uses it</w:t>
-      </w:r>
-    </w:p>
-    <w:p>
-      <w:pPr>
-        <w:pStyle w:val="FirstParagraph"/>
-        <w:rPr>
-          <w:rFonts w:asciiTheme="majorBidi" w:hAnsiTheme="majorBidi" w:cstheme="majorBidi"/>
-          <w:color w:val="FF0000"/>
-        </w:rPr>
-      </w:pPr>
+        <w:t xml:space="preserve">Chatbot: Muhammad will </w:t>
+      </w:r>
       <w:r>
         <w:rPr>
           <w:rFonts w:asciiTheme="majorBidi" w:hAnsiTheme="majorBidi" w:cstheme="majorBidi"/>
@@ -1467,11 +1436,54 @@
           <w:iCs/>
           <w:color w:val="FF0000"/>
         </w:rPr>
-        <w:t>This part is ready to be modified with Kevin and Jordan.</w:t>
+        <w:t xml:space="preserve">modify and </w:t>
+      </w:r>
+      <w:r>
+        <w:rPr>
+          <w:rFonts w:asciiTheme="majorBidi" w:hAnsiTheme="majorBidi" w:cstheme="majorBidi"/>
+          <w:i/>
+          <w:iCs/>
+          <w:color w:val="FF0000"/>
+        </w:rPr>
+        <w:t>add it to the corner of the page.</w:t>
       </w:r>
     </w:p>
     <w:p>
       <w:pPr>
+        <w:pStyle w:val="Heading2"/>
+        <w:rPr>
+          <w:rFonts w:asciiTheme="majorBidi" w:hAnsiTheme="majorBidi"/>
+        </w:rPr>
+      </w:pPr>
+      <w:bookmarkStart w:id="4" w:name="how-an-admin-uses-it"/>
+      <w:bookmarkEnd w:id="3"/>
+      <w:r>
+        <w:rPr>
+          <w:rFonts w:asciiTheme="majorBidi" w:hAnsiTheme="majorBidi"/>
+        </w:rPr>
+        <w:t>4. How an admin uses it</w:t>
+      </w:r>
+    </w:p>
+    <w:p>
+      <w:pPr>
+        <w:pStyle w:val="FirstParagraph"/>
+        <w:rPr>
+          <w:rFonts w:asciiTheme="majorBidi" w:hAnsiTheme="majorBidi" w:cstheme="majorBidi"/>
+          <w:color w:val="FF0000"/>
+        </w:rPr>
+      </w:pPr>
+      <w:r>
+        <w:rPr>
+          <w:rFonts w:asciiTheme="majorBidi" w:hAnsiTheme="majorBidi" w:cstheme="majorBidi"/>
+          <w:i/>
+          <w:iCs/>
+          <w:color w:val="FF0000"/>
+        </w:rPr>
+        <w:t>This part is ready to be modified with Kevin and Jordan.</w:t>
+      </w:r>
+    </w:p>
+    <w:p>
+      <w:pPr>
         <w:pStyle w:val="BodyText"/>
         <w:rPr>
           <w:rFonts w:asciiTheme="majorBidi" w:hAnsiTheme="majorBidi" w:cstheme="majorBidi"/>
@@ -1509,13 +1521,7 @@
         <w:rPr>
           <w:rFonts w:asciiTheme="majorBidi" w:hAnsiTheme="majorBidi" w:cstheme="majorBidi"/>
         </w:rPr>
-        <w:t xml:space="preserve">. It shows: - how often the model suggested each card, </w:t>
-      </w:r>
-      <w:r>
-        <w:rPr>
-          <w:rFonts w:asciiTheme="majorBidi" w:hAnsiTheme="majorBidi" w:cstheme="majorBidi"/>
-        </w:rPr>
-        <w:t>- the quiz: which statements students get wrong most often.</w:t>
+        <w:t>. It shows: - how often the model suggested each card, - the quiz: which statements students get wrong most often.</w:t>
       </w:r>
     </w:p>
     <w:p>
@@ -1743,15 +1749,9 @@
         <w:rPr>
           <w:rFonts w:asciiTheme="majorBidi" w:hAnsiTheme="majorBidi" w:cstheme="majorBidi"/>
         </w:rPr>
-        <w:t>Open the grey box under a guide (“See the text read from the PDF</w:t>
-      </w:r>
-      <w:r>
-        <w:rPr>
-          <w:rFonts w:asciiTheme="majorBidi" w:hAnsiTheme="majorBidi" w:cstheme="majorBidi"/>
-        </w:rPr>
-        <w:t>”) to see what was read.</w:t>
-      </w:r>
-      <w:bookmarkEnd w:id="0"/>
+        <w:t>Open the grey box under a guide (“See the text read from the PDF”) to see what was read.</w:t>
+      </w:r>
+      <w:bookmarkEnd w:id="1"/>
       <w:bookmarkEnd w:id="5"/>
     </w:p>
     <w:sectPr>

</xml_diff>